<commit_message>
Map and verify all 18 reference templates
- 11 DOCX letters/reports and 7 DMT PDF forms with sanitization, slots
  and field mappings; photo reports with 14 photo slots
- PDF inspector tool, image/line-art redaction, form flattening
- engine: placements log, slot knockout, conditional values
- vitest suite covering values, registry and generation of every template

Co-Authored-By: Claude Opus 5.5 <noreply@anthropic.com>
Claude-Session: https://claude.ai/code/session_01KhB95Q3CdNoHoGHNq4XQ7x
</commit_message>
<xml_diff>
--- a/templates/sanitized/number-of-users.docx
+++ b/templates/sanitized/number-of-users.docx
@@ -37,6 +37,18 @@
           <w:lang w:bidi="ar-AE"/>
         </w:rPr>
         <w:t xml:space="preserve">التاريخ: </w:t>
+      </w:r>
+      <w:r>
+        <w:rPr>
+          <w:rFonts w:ascii="DINArabic-Black" w:hAnsi="DINArabic-Black" w:cs="DINArabic-Black" w:eastAsia="DINArabic-Black"/>
+          <w:noProof/>
+          <w:szCs w:val="28"/>
+          <w:rtl/>
+          <w:lang w:bidi="ar-AE"/>
+          <w:sz w:val="28"/>
+          <w:color w:val="FFFFFF"/>
+        </w:rPr>
+        <w:t xml:space="preserve"> </w:t>
       </w:r>
       <w:r>
         <w:rPr>
@@ -325,6 +337,7 @@
           <w:insideV w:val="single" w:sz="4" w:space="0" w:color="auto"/>
         </w:tblBorders>
         <w:tblLook w:val="01E0" w:firstRow="1" w:lastRow="1" w:firstColumn="1" w:lastColumn="1" w:noHBand="0" w:noVBand="0"/>
+        <w:tblLayout w:type="fixed"/>
       </w:tblPr>
       <w:tblGrid>
         <w:gridCol w:w="7750"/>
@@ -353,6 +366,16 @@
                 <w:lang w:bidi="ar-AE"/>
               </w:rPr>
             </w:pPr>
+            <w:r>
+              <w:rPr>
+                <w:rFonts w:cs="Simplified Arabic" w:ascii="Simplified Arabic" w:hAnsi="Simplified Arabic" w:eastAsia="Simplified Arabic"/>
+                <w:szCs w:val="28"/>
+                <w:rtl/>
+                <w:sz w:val="28"/>
+                <w:color w:val="FFFFFF"/>
+              </w:rPr>
+              <w:t xml:space="preserve"> </w:t>
+            </w:r>
           </w:p>
         </w:tc>
         <w:tc>
@@ -438,6 +461,17 @@
                 <w:szCs w:val="28"/>
               </w:rPr>
             </w:pPr>
+            <w:r>
+              <w:rPr>
+                <w:rFonts w:ascii="Arial" w:hAnsi="Arial" w:cs="Arial" w:eastAsia="Arial"/>
+                <w:noProof/>
+                <w:szCs w:val="28"/>
+                <w:rtl/>
+                <w:sz w:val="28"/>
+                <w:color w:val="FFFFFF"/>
+              </w:rPr>
+              <w:t xml:space="preserve"> </w:t>
+            </w:r>
           </w:p>
         </w:tc>
         <w:tc>
@@ -524,6 +558,17 @@
                 <w:lang w:bidi="ar-AE"/>
               </w:rPr>
             </w:pPr>
+            <w:r>
+              <w:rPr>
+                <w:rFonts w:ascii="Arial" w:hAnsi="Arial" w:cs="Arial" w:eastAsia="Arial"/>
+                <w:noProof/>
+                <w:szCs w:val="28"/>
+                <w:rtl/>
+                <w:sz w:val="28"/>
+                <w:color w:val="FFFFFF"/>
+              </w:rPr>
+              <w:t xml:space="preserve"> </w:t>
+            </w:r>
           </w:p>
         </w:tc>
         <w:tc>
@@ -606,6 +651,17 @@
                 <w:szCs w:val="28"/>
               </w:rPr>
             </w:pPr>
+            <w:r>
+              <w:rPr>
+                <w:rFonts w:ascii="Arial" w:hAnsi="Arial" w:cs="Arial" w:eastAsia="Arial"/>
+                <w:noProof/>
+                <w:szCs w:val="28"/>
+                <w:rtl/>
+                <w:sz w:val="28"/>
+                <w:color w:val="FFFFFF"/>
+              </w:rPr>
+              <w:t xml:space="preserve"> </w:t>
+            </w:r>
           </w:p>
         </w:tc>
         <w:tc>

</xml_diff>